<commit_message>
fix: stream private daily cloud backups
</commit_message>
<xml_diff>
--- a/docs/maintenance/AI开发项目_Bug记录模板.docx
+++ b/docs/maintenance/AI开发项目_Bug记录模板.docx
@@ -14987,6 +14987,71 @@
     <w:p>
       <w:r>
         <w:t>发布身份：网页及私人内置源码v1239，原生iOS1.0.355（355）、桥37不变，不制作私人包。全量测试与实际Pages发布结果见v1239_浏览器运行诊断核验.md。DOCX仅追加并验证历史正文与其余ZIP成员保留；缺少LibreOffice，未完成页面渲染验收。</w:t>
+      </w:r>
+    </w:p>
+    <w:p>
+      <w:pPr>
+        <w:pStyle w:val="Heading1"/>
+      </w:pPr>
+      <w:r>
+        <w:rPr>
+          <w:rFonts w:ascii="Microsoft YaHei" w:hAnsi="Microsoft YaHei" w:eastAsia="Microsoft YaHei"/>
+        </w:rPr>
+        <w:t>2026-09-14 v1240 私人立即备份超时与每日备份恢复</w:t>
+      </w:r>
+    </w:p>
+    <w:p>
+      <w:pPr/>
+      <w:r>
+        <w:rPr>
+          <w:rFonts w:ascii="Microsoft YaHei" w:hAnsi="Microsoft YaHei" w:eastAsia="Microsoft YaHei"/>
+        </w:rPr>
+        <w:t>现象：私人 v1231 / iOS354 的授权与数据页显示最近云备份 54.0 MB；刷新状态正常，但点击立即备份出现“原生请求超时：account.backup.upload”。用户同时要求每天自动备份一次。</w:t>
+      </w:r>
+    </w:p>
+    <w:p>
+      <w:pPr/>
+      <w:r>
+        <w:rPr>
+          <w:rFonts w:ascii="Microsoft YaHei" w:hAnsi="Microsoft YaHei" w:eastAsia="Microsoft YaHei"/>
+        </w:rPr>
+        <w:t>事实与原因：旧网页把完整 snapshot 一次性交给原生桥；旧桥再对整份对象做 JSONSerialization、SHA-256 和 RPC body 组装，并沿用 18 秒网络超时和网页 60 秒等待。小账号请求成功与大上传成功不是同一证据。上述结构性缺陷已确认，但未取得当次真机内存和网络日志，不能宣称它是全部卡顿的唯一根因。</w:t>
+      </w:r>
+    </w:p>
+    <w:p>
+      <w:pPr/>
+      <w:r>
+        <w:rPr>
+          <w:rFonts w:ascii="Microsoft YaHei" w:hAnsi="Microsoft YaHei" w:eastAsia="Microsoft YaHei"/>
+        </w:rPr>
+        <w:t>修复：新增 account.backup.file.begin/chunk/commit/abort。网页每块 192 KiB，原生严格校验账号、令牌、偏移、单块和总长度，写入临时文件后使用 URLSession 文件上传；请求/资源/网页等待分别为 180/600/660 秒。成功、失败和中止均清理临时文件。只有 HTTP 成功且 RPC saved=true 才记成功。</w:t>
+      </w:r>
+    </w:p>
+    <w:p>
+      <w:pPr/>
+      <w:r>
+        <w:rPr>
+          <w:rFonts w:ascii="Microsoft YaHei" w:hAnsi="Microsoft YaHei" w:eastAsia="Microsoft YaHei"/>
+        </w:rPr>
+        <w:t>每日策略：前台空闲 90 秒后尝试；失败 30 分钟后重试；当天成功后不重复。首次升级、本机来源未确认、云端有其他设备更新或本机存档不完整时不自动覆盖。App 关闭时系统调度不保证每天准点。</w:t>
+      </w:r>
+    </w:p>
+    <w:p>
+      <w:pPr/>
+      <w:r>
+        <w:rPr>
+          <w:rFonts w:ascii="Microsoft YaHei" w:hAnsi="Microsoft YaHei" w:eastAsia="Microsoft YaHei"/>
+        </w:rPr>
+        <w:t>失败尝试与更正：v1233-v1238 的网页下载、分段导出和导入时序修改没有触及私人原生整对象上传。iOS247 暂停自动全量备份是诊断降压，不是已证明的最终修复。不能因为刷新状态正常就把问题归为用户操作或服务完全正常。</w:t>
+      </w:r>
+    </w:p>
+    <w:p>
+      <w:pPr/>
+      <w:r>
+        <w:rPr>
+          <w:rFonts w:ascii="Microsoft YaHei" w:hAnsi="Microsoft YaHei" w:eastAsia="Microsoft YaHei"/>
+        </w:rPr>
+        <w:t>验证：新路径行为与原生结构专项通过；大存档 Edge/WebKit 回归保留 10000 条消息和 48 张图片；核心聊天通过；全仓 1830/1830。Mac 编译、签名、真实 iPhone 54 MB 级上传、跨日自动备份和恢复尚未验证。</w:t>
       </w:r>
     </w:p>
     <w:sectPr>

</xml_diff>

<commit_message>
build: prepare complete private v1533 iOS438 overlay
</commit_message>
<xml_diff>
--- a/docs/maintenance/AI开发项目_Bug记录模板.docx
+++ b/docs/maintenance/AI开发项目_Bug记录模板.docx
@@ -15631,6 +15631,11 @@
     <ns0:p>
       <ns0:r>
         <ns0:t>v1532/v1533发布候选：全量3112/3112通过，两端头像归属、SVG按钮、返回主页、历史搜索、转发快照、写信/回信浏览器回归通过；正常授权聊天核验记录.codex_tmp/mail1532-chat.log。私人仅同步源码，无打包。</ns0:t>
+      </ns0:r>
+    </ns0:p>
+    <ns0:p>
+      <ns0:r>
+        <ns0:t>2026-10-04 私人v1533 / iOS438完整覆盖包：基于已发布网页v1532同步源码，包含旅行付款备注名、请求故障诊断与挂断取消、信箱历史搜索/转发/绑定原信回复/账号隔离、SVG回复转发、购买方头像和主页返回。原生桥42、签名标识、私人专属功能及资源保留。以提交树构建，与v1525/iOS437交付清单逐项比较并解压校验。Windows验证与Mac编译、签名、真实iPhone证据分开记录；不是已签名IPA。</ns0:t>
       </ns0:r>
     </ns0:p>
     <ns0:sectPr ns0:rsidR="00FC693F" ns0:rsidRPr="0006063C" ns0:rsidSect="00034616">

</xml_diff>

<commit_message>
fix: liquid glass refracts the wallpaper live while swiping home pages web v1718
Co-Authored-By: Claude Opus 5.5 <noreply@anthropic.com>
Claude-Session: https://claude.ai/code/session_017e35gCpQUoUfZvpbtFWA4Y
</commit_message>
<xml_diff>
--- a/docs/maintenance/AI开发项目_Bug记录模板.docx
+++ b/docs/maintenance/AI开发项目_Bug记录模板.docx
@@ -17844,6 +17844,11 @@
     <ns0:p>
       <ns0:r>
         <ns0:t xml:space="preserve">2026-10-11 v1716 主屏组件液态玻璃（网页，私人不动）。旧问题：Codex 版每组件拍背景快照、监听DOM/滚动/离屏反复装饰，真机掉材质、卡顿、滑主屏闪烁，已多次回退。根因：材质依赖持续重算和快照替换。新方案：共用离屏WebGL把每个组件烤成静态2D画布插进组件内部，按组件所在页静止位置计算折射，翻页时随页滑动不重算；仅壁纸/参数/尺寸/位置变化重烤并缓存；不监听scroll、不用MutationObserver/getImageData/toDataURL；画布就绪前保留原玻璃；上下文丢失不影响已放入的画布。测试：翻页41帧重烤0、20次render重烤0、改参数重烤6；关闭后完全移除。未做iPhone真机验收。</ns0:t>
+      </ns0:r>
+    </ns0:p>
+    <ns0:p>
+      <ns0:r>
+        <ns0:t xml:space="preserve">2026-10-11 v1718：用户反馈液态玻璃内壁纸定格在组件原位、滑动时不随背景变化。原因：v1716按静止位置一次性烤图，画布随组件一起移动。修复：仅在#appswipe passive scroll时用rAF每帧重画屏幕上可见组件，位置由scrollLeft推算不读布局；滑动中0.6倍分辨率，停下140ms后原分辨率；画布记录上次位置/分辨率避免重复绘制，静止render仍0次绘制；仍不拍快照/不用MutationObserver。测试：滑动21步122次绘制，静止两次render 0次绘制，中途截图玻璃内条纹与外部壁纸对齐；真机帧率待用户验收。</ns0:t>
       </ns0:r>
     </ns0:p>
     <ns0:sectPr ns0:rsidR="00FC693F" ns0:rsidRPr="0006063C" ns0:rsidSect="00034616">

</xml_diff>